<commit_message>
Road map: quotes as release epigraphs, UI agreement in 0.2
- Release briefs are quotes of great people instead of travel analogies
- 0.1: the operator works with the real instrument; the emulator is for developers
- 0.2: agree the main building blocks of the new user interface with the customer
- Rebuild roadmap.docx and spec.docx

Co-Authored-By: Claude Opus 5.5 (1M context) <noreply@anthropic.com>
</commit_message>
<xml_diff>
--- a/docs/roadmap.docx
+++ b/docs/roadmap.docx
@@ -726,6 +726,30 @@
             </w:pPr>
             <w:r>
               <w:t xml:space="preserve">0.1 Yekaterinburg</w:t>
+            </w:r>
+          </w:p>
+        </w:tc>
+      </w:tr>
+      <w:tr>
+        <w:tc>
+          <w:tcPr/>
+          <w:p>
+            <w:pPr>
+              <w:pStyle w:val="Compact"/>
+            </w:pPr>
+            <w:r>
+              <w:t xml:space="preserve">New user interface: main building blocks agreed with you</w:t>
+            </w:r>
+          </w:p>
+        </w:tc>
+        <w:tc>
+          <w:tcPr/>
+          <w:p>
+            <w:pPr>
+              <w:pStyle w:val="Compact"/>
+            </w:pPr>
+            <w:r>
+              <w:t xml:space="preserve">0.2 Moscow</w:t>
             </w:r>
           </w:p>
         </w:tc>
@@ -1989,7 +2013,13 @@
           <w:i/>
           <w:iCs/>
         </w:rPr>
-        <w:t xml:space="preserve">Before a long journey, you check the vehicle, pack the essentials and take a test drive around town. We don’t leave the city yet — we make sure the car is ready for the road.</w:t>
+        <w:t xml:space="preserve">“Give me a place to stand, and I will move the earth.”</w:t>
+      </w:r>
+      <w:r>
+        <w:t xml:space="preserve"> </w:t>
+      </w:r>
+      <w:r>
+        <w:t xml:space="preserve">— Archimedes</w:t>
       </w:r>
     </w:p>
     <w:p>
@@ -2213,7 +2243,7 @@
         <w:t xml:space="preserve"> </w:t>
       </w:r>
       <w:r>
-        <w:t xml:space="preserve">Install the application yourself and operate the instrument on the Sparx instrument emulator: manual control, live data, instrument settings and crucible tests. Testing on a real instrument is planned for later releases.</w:t>
+        <w:t xml:space="preserve">Install the application yourself and operate your HAWK instrument from a web browser: manual control, live data, instrument settings and crucible tests. The Sparx instrument emulator is a developer tool, used for automated tests.</w:t>
       </w:r>
     </w:p>
     <w:p>
@@ -2265,7 +2295,19 @@
           <w:i/>
           <w:iCs/>
         </w:rPr>
-        <w:t xml:space="preserve">The first leg is the longest one on land — about 1,800 km of road. Before setting off, we move all the luggage into a new, larger trailer with no weight limit, and pack it so that everything is easy to find. At the first big city we unpack and check that nothing was lost on the way.</w:t>
+        <w:t xml:space="preserve">“It is a capital mistake to theorize before one has data.”</w:t>
+      </w:r>
+      <w:r>
+        <w:t xml:space="preserve"> </w:t>
+      </w:r>
+      <w:r>
+        <w:t xml:space="preserve">— Arthur Conan Doyle, Sherlock Holmes in</w:t>
+      </w:r>
+      <w:r>
+        <w:t xml:space="preserve"> </w:t>
+      </w:r>
+      <w:r>
+        <w:t xml:space="preserve">“A Scandal in Bohemia”</w:t>
       </w:r>
     </w:p>
     <w:p>
@@ -2283,7 +2325,7 @@
         <w:t xml:space="preserve"> </w:t>
       </w:r>
       <w:r>
-        <w:t xml:space="preserve">Move your existing HAWK-EYE data to the new database and let you browse it in a web browser.</w:t>
+        <w:t xml:space="preserve">Move your existing HAWK-EYE data to the new database, let you browse it in a web browser, and agree with you on the new user interface.</w:t>
       </w:r>
     </w:p>
     <w:p>
@@ -2355,6 +2397,28 @@
           <w:b/>
           <w:bCs/>
         </w:rPr>
+        <w:t xml:space="preserve">New user interface.</w:t>
+      </w:r>
+      <w:r>
+        <w:t xml:space="preserve"> </w:t>
+      </w:r>
+      <w:r>
+        <w:t xml:space="preserve">We discuss the new user interface with you and fix its main building blocks: page layout, navigation, the main screens and their controls. The sample table and the sample chart viewer of this release are the first screens built on them.</w:t>
+      </w:r>
+    </w:p>
+    <w:p>
+      <w:pPr>
+        <w:pStyle w:val="Compact"/>
+        <w:numPr>
+          <w:ilvl w:val="0"/>
+          <w:numId w:val="1006"/>
+        </w:numPr>
+      </w:pPr>
+      <w:r>
+        <w:rPr>
+          <w:b/>
+          <w:bCs/>
+        </w:rPr>
         <w:t xml:space="preserve">Sample table.</w:t>
       </w:r>
       <w:r>
@@ -2423,7 +2487,7 @@
         <w:t xml:space="preserve"> </w:t>
       </w:r>
       <w:r>
-        <w:t xml:space="preserve">Transfer a copy of your own database with the migration tool, then browse your samples and their curves in the new application and check that everything has arrived.</w:t>
+        <w:t xml:space="preserve">Transfer a copy of your own database with the migration tool, then browse your samples and their curves in the new application and check that everything has arrived. The main building blocks of the new user interface are agreed with you.</w:t>
       </w:r>
     </w:p>
     <w:p>
@@ -2475,7 +2539,13 @@
           <w:i/>
           <w:iCs/>
         </w:rPr>
-        <w:t xml:space="preserve">So far the car has carried only luggage. On the way to Berlin it takes its first passengers — first one at a time, then a full bus running on a timetable.</w:t>
+        <w:t xml:space="preserve">“When you can measure what you are speaking about, and express it in numbers, you know something about it.”</w:t>
+      </w:r>
+      <w:r>
+        <w:t xml:space="preserve"> </w:t>
+      </w:r>
+      <w:r>
+        <w:t xml:space="preserve">— Lord Kelvin</w:t>
       </w:r>
     </w:p>
     <w:p>
@@ -2707,7 +2777,13 @@
           <w:i/>
           <w:iCs/>
         </w:rPr>
-        <w:t xml:space="preserve">Lisbon is the westernmost point of Europe. Before crossing the ocean, the vehicle must be fully self-sufficient: everything needed for the journey has to be on board.</w:t>
+        <w:t xml:space="preserve">“The first principle is that you must not fool yourself — and you are the easiest person to fool.”</w:t>
+      </w:r>
+      <w:r>
+        <w:t xml:space="preserve"> </w:t>
+      </w:r>
+      <w:r>
+        <w:t xml:space="preserve">— Richard Feynman</w:t>
       </w:r>
     </w:p>
     <w:p>
@@ -2961,7 +3037,13 @@
           <w:i/>
           <w:iCs/>
         </w:rPr>
-        <w:t xml:space="preserve">On a ship every kilogram counts. Before boarding, we unpack the luggage, leave behind what is no longer needed and repack the rest neatly. And everyone who travels with us gets on board.</w:t>
+        <w:t xml:space="preserve">“Perfection is achieved, not when there is nothing more to add, but when there is nothing left to take away.”</w:t>
+      </w:r>
+      <w:r>
+        <w:t xml:space="preserve"> </w:t>
+      </w:r>
+      <w:r>
+        <w:t xml:space="preserve">— Antoine de Saint-Exupéry</w:t>
       </w:r>
     </w:p>
     <w:p>
@@ -3171,7 +3253,13 @@
           <w:i/>
           <w:iCs/>
         </w:rPr>
-        <w:t xml:space="preserve">We have arrived at your door. Now it’s time to unpack and arrange everything to your taste.</w:t>
+        <w:t xml:space="preserve">“Design is not just what it looks like and feels like. Design is how it works.”</w:t>
+      </w:r>
+      <w:r>
+        <w:t xml:space="preserve"> </w:t>
+      </w:r>
+      <w:r>
+        <w:t xml:space="preserve">— Steve Jobs</w:t>
       </w:r>
     </w:p>
     <w:p>

</xml_diff>

<commit_message>
Road map: remove durations
Co-Authored-By: Claude Opus 5.5 (1M context) <noreply@anthropic.com>
</commit_message>
<xml_diff>
--- a/docs/roadmap.docx
+++ b/docs/roadmap.docx
@@ -1416,10 +1416,9 @@
         <w:tblLook w:firstRow="1" w:lastRow="0" w:firstColumn="0" w:lastColumn="0" w:noHBand="0" w:noVBand="0" w:val="0020"/>
       </w:tblPr>
       <w:tblGrid>
-        <w:gridCol w:w="1980"/>
-        <w:gridCol w:w="1980"/>
-        <w:gridCol w:w="1980"/>
-        <w:gridCol w:w="1980"/>
+        <w:gridCol w:w="2640"/>
+        <w:gridCol w:w="2640"/>
+        <w:gridCol w:w="2640"/>
       </w:tblGrid>
       <w:tr>
         <w:trPr>
@@ -1458,17 +1457,6 @@
             </w:r>
           </w:p>
         </w:tc>
-        <w:tc>
-          <w:tcPr/>
-          <w:p>
-            <w:pPr>
-              <w:pStyle w:val="Compact"/>
-            </w:pPr>
-            <w:r>
-              <w:t xml:space="preserve">Duration</w:t>
-            </w:r>
-          </w:p>
-        </w:tc>
       </w:tr>
       <w:tr>
         <w:tc>
@@ -1504,17 +1492,6 @@
             </w:r>
           </w:p>
         </w:tc>
-        <w:tc>
-          <w:tcPr/>
-          <w:p>
-            <w:pPr>
-              <w:pStyle w:val="Compact"/>
-            </w:pPr>
-            <w:r>
-              <w:t xml:space="preserve">~14 weeks</w:t>
-            </w:r>
-          </w:p>
-        </w:tc>
       </w:tr>
       <w:tr>
         <w:tc>
@@ -1550,17 +1527,6 @@
             </w:r>
           </w:p>
         </w:tc>
-        <w:tc>
-          <w:tcPr/>
-          <w:p>
-            <w:pPr>
-              <w:pStyle w:val="Compact"/>
-            </w:pPr>
-            <w:r>
-              <w:t xml:space="preserve">~13 weeks</w:t>
-            </w:r>
-          </w:p>
-        </w:tc>
       </w:tr>
       <w:tr>
         <w:tc>
@@ -1596,17 +1562,6 @@
             </w:r>
           </w:p>
         </w:tc>
-        <w:tc>
-          <w:tcPr/>
-          <w:p>
-            <w:pPr>
-              <w:pStyle w:val="Compact"/>
-            </w:pPr>
-            <w:r>
-              <w:t xml:space="preserve">~13.5 weeks</w:t>
-            </w:r>
-          </w:p>
-        </w:tc>
       </w:tr>
       <w:tr>
         <w:tc>
@@ -1642,17 +1597,6 @@
             </w:r>
           </w:p>
         </w:tc>
-        <w:tc>
-          <w:tcPr/>
-          <w:p>
-            <w:pPr>
-              <w:pStyle w:val="Compact"/>
-            </w:pPr>
-            <w:r>
-              <w:t xml:space="preserve">~14 weeks</w:t>
-            </w:r>
-          </w:p>
-        </w:tc>
       </w:tr>
       <w:tr>
         <w:tc>
@@ -1688,17 +1632,6 @@
             </w:r>
           </w:p>
         </w:tc>
-        <w:tc>
-          <w:tcPr/>
-          <w:p>
-            <w:pPr>
-              <w:pStyle w:val="Compact"/>
-            </w:pPr>
-            <w:r>
-              <w:t xml:space="preserve">~13.5 weeks</w:t>
-            </w:r>
-          </w:p>
-        </w:tc>
       </w:tr>
       <w:tr>
         <w:tc>
@@ -1734,65 +1667,6 @@
             </w:r>
           </w:p>
         </w:tc>
-        <w:tc>
-          <w:tcPr/>
-          <w:p>
-            <w:pPr>
-              <w:pStyle w:val="Compact"/>
-            </w:pPr>
-            <w:r>
-              <w:t xml:space="preserve">~13 weeks</w:t>
-            </w:r>
-          </w:p>
-        </w:tc>
-      </w:tr>
-      <w:tr>
-        <w:tc>
-          <w:tcPr/>
-          <w:p>
-            <w:pPr>
-              <w:pStyle w:val="Compact"/>
-            </w:pPr>
-          </w:p>
-        </w:tc>
-        <w:tc>
-          <w:tcPr/>
-          <w:p>
-            <w:pPr>
-              <w:pStyle w:val="Compact"/>
-            </w:pPr>
-          </w:p>
-        </w:tc>
-        <w:tc>
-          <w:tcPr/>
-          <w:p>
-            <w:pPr>
-              <w:pStyle w:val="Compact"/>
-            </w:pPr>
-            <w:r>
-              <w:rPr>
-                <w:b/>
-                <w:bCs/>
-              </w:rPr>
-              <w:t xml:space="preserve">Total</w:t>
-            </w:r>
-          </w:p>
-        </w:tc>
-        <w:tc>
-          <w:tcPr/>
-          <w:p>
-            <w:pPr>
-              <w:pStyle w:val="Compact"/>
-            </w:pPr>
-            <w:r>
-              <w:rPr>
-                <w:b/>
-                <w:bCs/>
-              </w:rPr>
-              <w:t xml:space="preserve">~81 weeks</w:t>
-            </w:r>
-          </w:p>
-        </w:tc>
       </w:tr>
     </w:tbl>
     <w:p>
@@ -1800,7 +1674,7 @@
         <w:pStyle w:val="BodyText"/>
       </w:pPr>
       <w:r>
-        <w:t xml:space="preserve">Durations are calendar weeks for a team of one developer; the whole route takes about 19 months. Each release includes automated testing, delivery, and changes based on your feedback on the previous release.</w:t>
+        <w:t xml:space="preserve">Each release includes automated testing, delivery, and changes based on your feedback on the previous release.</w:t>
       </w:r>
     </w:p>
     <w:bookmarkStart w:id="28" w:name="quality-assurance"/>
@@ -1983,7 +1857,7 @@
       </w:r>
     </w:p>
     <w:bookmarkEnd w:id="28"/>
-    <w:bookmarkStart w:id="29" w:name="X01b5d79626525eea419e5f7bf94dbb68ba46fbb"/>
+    <w:bookmarkStart w:id="29" w:name="Xf9b18179fe70c5593bf04454970a6b21c2d4bd3"/>
     <w:p>
       <w:pPr>
         <w:pStyle w:val="Heading2"/>
@@ -2001,7 +1875,7 @@
         <w:t xml:space="preserve"> </w:t>
       </w:r>
       <w:r>
-        <w:t xml:space="preserve">— The instrument in your browser (~14 weeks)</w:t>
+        <w:t xml:space="preserve">— The instrument in your browser</w:t>
       </w:r>
     </w:p>
     <w:p>
@@ -2265,7 +2139,7 @@
       </w:r>
     </w:p>
     <w:bookmarkEnd w:id="29"/>
-    <w:bookmarkStart w:id="30" w:name="X5ad4a2a38b570b97c123a75f34baa369d10a9eb"/>
+    <w:bookmarkStart w:id="30" w:name="version-0.2-moscow-your-data-moves-in"/>
     <w:p>
       <w:pPr>
         <w:pStyle w:val="Heading2"/>
@@ -2283,7 +2157,7 @@
         <w:t xml:space="preserve"> </w:t>
       </w:r>
       <w:r>
-        <w:t xml:space="preserve">— Your data moves in (~13 weeks)</w:t>
+        <w:t xml:space="preserve">— Your data moves in</w:t>
       </w:r>
     </w:p>
     <w:p>
@@ -2509,7 +2383,7 @@
       </w:r>
     </w:p>
     <w:bookmarkEnd w:id="30"/>
-    <w:bookmarkStart w:id="31" w:name="X31045dfcd8a35fac304f51fd27ebecb9c00cef9"/>
+    <w:bookmarkStart w:id="31" w:name="version-0.3-berlin-first-analyses"/>
     <w:p>
       <w:pPr>
         <w:pStyle w:val="Heading2"/>
@@ -2527,7 +2401,7 @@
         <w:t xml:space="preserve"> </w:t>
       </w:r>
       <w:r>
-        <w:t xml:space="preserve">— First analyses (~13.5 weeks)</w:t>
+        <w:t xml:space="preserve">— First analyses</w:t>
       </w:r>
     </w:p>
     <w:p>
@@ -2747,7 +2621,7 @@
       </w:r>
     </w:p>
     <w:bookmarkEnd w:id="31"/>
-    <w:bookmarkStart w:id="32" w:name="version-0.4-lisbon-results-14-weeks"/>
+    <w:bookmarkStart w:id="32" w:name="version-0.4-lisbon-results"/>
     <w:p>
       <w:pPr>
         <w:pStyle w:val="Heading2"/>
@@ -2765,7 +2639,7 @@
         <w:t xml:space="preserve"> </w:t>
       </w:r>
       <w:r>
-        <w:t xml:space="preserve">— Results (~14 weeks)</w:t>
+        <w:t xml:space="preserve">— Results</w:t>
       </w:r>
     </w:p>
     <w:p>
@@ -3007,7 +2881,7 @@
       </w:r>
     </w:p>
     <w:bookmarkEnd w:id="32"/>
-    <w:bookmarkStart w:id="33" w:name="X67722ec4a26e643e9fd69af2a757a4528e43e4b"/>
+    <w:bookmarkStart w:id="33" w:name="X889329dfcc4febb22d4fa37d9ad9935eddaca06"/>
     <w:p>
       <w:pPr>
         <w:pStyle w:val="Heading2"/>
@@ -3025,7 +2899,7 @@
         <w:t xml:space="preserve"> </w:t>
       </w:r>
       <w:r>
-        <w:t xml:space="preserve">— All methods, settings in order (~13.5 weeks)</w:t>
+        <w:t xml:space="preserve">— All methods, settings in order</w:t>
       </w:r>
     </w:p>
     <w:p>
@@ -3223,7 +3097,7 @@
       </w:r>
     </w:p>
     <w:bookmarkEnd w:id="33"/>
-    <w:bookmarkStart w:id="34" w:name="X049cc6617ef9420cc681b454461b29addb546b2"/>
+    <w:bookmarkStart w:id="34" w:name="X3e02aba499d69bc3afda5453688ce490ee59db4"/>
     <w:p>
       <w:pPr>
         <w:pStyle w:val="Heading2"/>
@@ -3241,7 +3115,7 @@
         <w:t xml:space="preserve"> </w:t>
       </w:r>
       <w:r>
-        <w:t xml:space="preserve">— Reports and personal preferences (~13 weeks)</w:t>
+        <w:t xml:space="preserve">— Reports and personal preferences</w:t>
       </w:r>
     </w:p>
     <w:p>

</xml_diff>